<commit_message>
feat(srf): fix dropdown state sync, label validation, update date-based docs, and zip utility
</commit_message>
<xml_diff>
--- a/docs/USER_MANUAL_CHANGES.docx
+++ b/docs/USER_MANUAL_CHANGES.docx
@@ -13,7 +13,7 @@
           <w:color w:val="D97706"/>
           <w:sz w:val="24"/>
         </w:rPr>
-        <w:t>FACE Prep Campus — PMS</w:t>
+        <w:t>FACE Prep Campus — Placement Management System</w:t>
         <w:br/>
       </w:r>
       <w:r>
@@ -23,7 +23,7 @@
           <w:color w:val="3D3777"/>
           <w:sz w:val="36"/>
         </w:rPr>
-        <w:t>Recent System Changes &amp; User Manual Summary</w:t>
+        <w:t>User Manual Updates &amp; Release Changelog</w:t>
       </w:r>
     </w:p>
     <w:p>
@@ -36,12 +36,426 @@
           <w:color w:val="64748B"/>
           <w:sz w:val="20"/>
         </w:rPr>
-        <w:t>Key updates to Student Registration (SRF) and Coordinator Verification Queue</w:t>
+        <w:t>Date-wise operational record of system enhancements, user manual adjustments, and bug fixes from September 04 to September 11, 2026.</w:t>
       </w:r>
     </w:p>
     <w:p>
       <w:pPr>
-        <w:spacing w:before="240" w:after="80"/>
+        <w:spacing w:before="280" w:after="80"/>
+      </w:pPr>
+      <w:r>
+        <w:rPr>
+          <w:rFonts w:ascii="Segoe UI" w:hAnsi="Segoe UI"/>
+          <w:b/>
+          <w:color w:val="D97706"/>
+          <w:sz w:val="24"/>
+        </w:rPr>
+        <w:t xml:space="preserve">[September 11, 2026] </w:t>
+      </w:r>
+      <w:r>
+        <w:rPr>
+          <w:rFonts w:ascii="Segoe UI" w:hAnsi="Segoe UI"/>
+          <w:b/>
+          <w:color w:val="3D3777"/>
+          <w:sz w:val="24"/>
+        </w:rPr>
+        <w:t>SRF Dropdown Synchronization, Conditional Field Sanitization &amp; Label Validation</w:t>
+      </w:r>
+    </w:p>
+    <w:p>
+      <w:pPr>
+        <w:pStyle w:val="ListBullet"/>
+        <w:spacing w:before="30" w:after="40" w:line="276" w:lineRule="auto"/>
+      </w:pPr>
+      <w:r>
+        <w:rPr>
+          <w:rFonts w:ascii="Segoe UI" w:hAnsi="Segoe UI"/>
+          <w:b/>
+          <w:color w:val="3D3777"/>
+          <w:sz w:val="19"/>
+        </w:rPr>
+        <w:t xml:space="preserve">Dropdown Value Replacement &amp; State Sync: </w:t>
+      </w:r>
+      <w:r>
+        <w:rPr>
+          <w:rFonts w:ascii="Segoe UI" w:hAnsi="Segoe UI"/>
+          <w:color w:val="282828"/>
+          <w:sz w:val="19"/>
+        </w:rPr>
+        <w:t>When modifying any dropdown selection in the Student Registration Form (such as school board, marks scale, or degree fork), previous values are cleanly replaced. Form state stays completely synchronized with what the student sees on screen.</w:t>
+      </w:r>
+    </w:p>
+    <w:p>
+      <w:pPr>
+        <w:pStyle w:val="ListBullet"/>
+        <w:spacing w:before="30" w:after="40" w:line="276" w:lineRule="auto"/>
+      </w:pPr>
+      <w:r>
+        <w:rPr>
+          <w:rFonts w:ascii="Segoe UI" w:hAnsi="Segoe UI"/>
+          <w:b/>
+          <w:color w:val="3D3777"/>
+          <w:sz w:val="19"/>
+        </w:rPr>
+        <w:t xml:space="preserve">Automatic Obsolete Field Sanitization: </w:t>
+      </w:r>
+      <w:r>
+        <w:rPr>
+          <w:rFonts w:ascii="Segoe UI" w:hAnsi="Segoe UI"/>
+          <w:color w:val="282828"/>
+          <w:sz w:val="19"/>
+        </w:rPr>
+        <w:t>Switching away from conditional options (e.g. from State Board to CBSE, or from PG to UG) immediately wipes obsolete child fields (State Board state, Other board name, Cambridge/Other grades, completed UG degree details, and consolidated marksheets) from both the active form state and saved drafts. This eliminates hidden validation blocks caused by lingering orphan data.</w:t>
+      </w:r>
+    </w:p>
+    <w:p>
+      <w:pPr>
+        <w:pStyle w:val="ListBullet"/>
+        <w:spacing w:before="30" w:after="40" w:line="276" w:lineRule="auto"/>
+      </w:pPr>
+      <w:r>
+        <w:rPr>
+          <w:rFonts w:ascii="Segoe UI" w:hAnsi="Segoe UI"/>
+          <w:b/>
+          <w:color w:val="3D3777"/>
+          <w:sz w:val="19"/>
+        </w:rPr>
+        <w:t xml:space="preserve">Immediate Scale Switch Revalidation: </w:t>
+      </w:r>
+      <w:r>
+        <w:rPr>
+          <w:rFonts w:ascii="Segoe UI" w:hAnsi="Segoe UI"/>
+          <w:color w:val="282828"/>
+          <w:sz w:val="19"/>
+        </w:rPr>
+        <w:t>Changing the College Marks Scale between CGPA (10-point scale) and Percentage immediately re-evaluates all semester figures in real time without requiring the student to click submit.</w:t>
+      </w:r>
+    </w:p>
+    <w:p>
+      <w:pPr>
+        <w:pStyle w:val="ListBullet"/>
+        <w:spacing w:before="30" w:after="40" w:line="276" w:lineRule="auto"/>
+      </w:pPr>
+      <w:r>
+        <w:rPr>
+          <w:rFonts w:ascii="Segoe UI" w:hAnsi="Segoe UI"/>
+          <w:b/>
+          <w:color w:val="3D3777"/>
+          <w:sz w:val="19"/>
+        </w:rPr>
+        <w:t xml:space="preserve">Field Label Validation Highlighting (Red Labels &amp; 'Invalid' Badge): </w:t>
+      </w:r>
+      <w:r>
+        <w:rPr>
+          <w:rFonts w:ascii="Segoe UI" w:hAnsi="Segoe UI"/>
+          <w:color w:val="282828"/>
+          <w:sz w:val="19"/>
+        </w:rPr>
+        <w:t>Every required or invalid field now directly highlights its label in bold red (text-danger-700 font-semibold) with a clear, accessible 'Invalid' badge. Students can immediately see which exact field is missing or contains formatting errors.</w:t>
+      </w:r>
+    </w:p>
+    <w:p>
+      <w:pPr>
+        <w:pStyle w:val="ListBullet"/>
+        <w:spacing w:before="30" w:after="40" w:line="276" w:lineRule="auto"/>
+      </w:pPr>
+      <w:r>
+        <w:rPr>
+          <w:rFonts w:ascii="Segoe UI" w:hAnsi="Segoe UI"/>
+          <w:b/>
+          <w:color w:val="3D3777"/>
+          <w:sz w:val="19"/>
+        </w:rPr>
+        <w:t xml:space="preserve">Real-Time Error Clearing: </w:t>
+      </w:r>
+      <w:r>
+        <w:rPr>
+          <w:rFonts w:ascii="Segoe UI" w:hAnsi="Segoe UI"/>
+          <w:color w:val="282828"/>
+          <w:sz w:val="19"/>
+        </w:rPr>
+        <w:t>As soon as the user corrects an invalid input or selects a valid option, the red label styling, error badge, and red border clear instantly in real time.</w:t>
+      </w:r>
+    </w:p>
+    <w:p>
+      <w:pPr>
+        <w:pStyle w:val="ListBullet"/>
+        <w:spacing w:before="30" w:after="40" w:line="276" w:lineRule="auto"/>
+      </w:pPr>
+      <w:r>
+        <w:rPr>
+          <w:rFonts w:ascii="Segoe UI" w:hAnsi="Segoe UI"/>
+          <w:b/>
+          <w:color w:val="3D3777"/>
+          <w:sz w:val="19"/>
+        </w:rPr>
+        <w:t xml:space="preserve">Consolidated Error Messaging: </w:t>
+      </w:r>
+      <w:r>
+        <w:rPr>
+          <w:rFonts w:ascii="Segoe UI" w:hAnsi="Segoe UI"/>
+          <w:color w:val="282828"/>
+          <w:sz w:val="19"/>
+        </w:rPr>
+        <w:t>Removed duplicate alert nodes and standardized error rendering across all inputs, ensuring clean DOM structure and eliminating confusing repeated messages.</w:t>
+      </w:r>
+    </w:p>
+    <w:p>
+      <w:pPr>
+        <w:spacing w:before="280" w:after="80"/>
+      </w:pPr>
+      <w:r>
+        <w:rPr>
+          <w:rFonts w:ascii="Segoe UI" w:hAnsi="Segoe UI"/>
+          <w:b/>
+          <w:color w:val="D97706"/>
+          <w:sz w:val="24"/>
+        </w:rPr>
+        <w:t xml:space="preserve">[September 10, 2026] </w:t>
+      </w:r>
+      <w:r>
+        <w:rPr>
+          <w:rFonts w:ascii="Segoe UI" w:hAnsi="Segoe UI"/>
+          <w:b/>
+          <w:color w:val="3D3777"/>
+          <w:sz w:val="24"/>
+        </w:rPr>
+        <w:t>Coordinator Verification Queue Enhancements &amp; Database Arrears Sync (Migrations 0071–0074)</w:t>
+      </w:r>
+    </w:p>
+    <w:p>
+      <w:pPr>
+        <w:pStyle w:val="ListBullet"/>
+        <w:spacing w:before="30" w:after="40" w:line="276" w:lineRule="auto"/>
+      </w:pPr>
+      <w:r>
+        <w:rPr>
+          <w:rFonts w:ascii="Segoe UI" w:hAnsi="Segoe UI"/>
+          <w:b/>
+          <w:color w:val="3D3777"/>
+          <w:sz w:val="19"/>
+        </w:rPr>
+        <w:t xml:space="preserve">International Board Letter Grades Display: </w:t>
+      </w:r>
+      <w:r>
+        <w:rPr>
+          <w:rFonts w:ascii="Segoe UI" w:hAnsi="Segoe UI"/>
+          <w:color w:val="282828"/>
+          <w:sz w:val="19"/>
+        </w:rPr>
+        <w:t>In the CPC verification queue (/cpc/verification), the 10th and 12th marks columns now display letter grades (e.g., 'Grade: A*' or '91.4% (Grade: A*)') so coordinators can easily verify Cambridge (IGCSE/A-Levels) and Other board results without confusion.</w:t>
+      </w:r>
+    </w:p>
+    <w:p>
+      <w:pPr>
+        <w:pStyle w:val="ListBullet"/>
+        <w:spacing w:before="30" w:after="40" w:line="276" w:lineRule="auto"/>
+      </w:pPr>
+      <w:r>
+        <w:rPr>
+          <w:rFonts w:ascii="Segoe UI" w:hAnsi="Segoe UI"/>
+          <w:b/>
+          <w:color w:val="3D3777"/>
+          <w:sz w:val="19"/>
+        </w:rPr>
+        <w:t xml:space="preserve">Arrear History Discrepancy Resolution (2 vs 1): </w:t>
+      </w:r>
+      <w:r>
+        <w:rPr>
+          <w:rFonts w:ascii="Segoe UI" w:hAnsi="Segoe UI"/>
+          <w:color w:val="282828"/>
+          <w:sz w:val="19"/>
+        </w:rPr>
+        <w:t>Fixed a bug where a student who declared 2 arrears across degree semesters showed only 1 in the coordinator queue. The queue now accurately evaluates the true cumulative maximum across all declared semesters.</w:t>
+      </w:r>
+    </w:p>
+    <w:p>
+      <w:pPr>
+        <w:pStyle w:val="ListBullet"/>
+        <w:spacing w:before="30" w:after="40" w:line="276" w:lineRule="auto"/>
+      </w:pPr>
+      <w:r>
+        <w:rPr>
+          <w:rFonts w:ascii="Segoe UI" w:hAnsi="Segoe UI"/>
+          <w:b/>
+          <w:color w:val="3D3777"/>
+          <w:sz w:val="19"/>
+        </w:rPr>
+        <w:t xml:space="preserve">Automated Standing Arrears Synchronization: </w:t>
+      </w:r>
+      <w:r>
+        <w:rPr>
+          <w:rFonts w:ascii="Segoe UI" w:hAnsi="Segoe UI"/>
+          <w:color w:val="282828"/>
+          <w:sz w:val="19"/>
+        </w:rPr>
+        <w:t>The student's declared standing arrears from their latest semester are automatically synchronized into the core students table on form submission (via Migration 0073), ensuring recruiter drive eligibility filters always read current academic data.</w:t>
+      </w:r>
+    </w:p>
+    <w:p>
+      <w:pPr>
+        <w:pStyle w:val="ListBullet"/>
+        <w:spacing w:before="30" w:after="40" w:line="276" w:lineRule="auto"/>
+      </w:pPr>
+      <w:r>
+        <w:rPr>
+          <w:rFonts w:ascii="Segoe UI" w:hAnsi="Segoe UI"/>
+          <w:b/>
+          <w:color w:val="3D3777"/>
+          <w:sz w:val="19"/>
+        </w:rPr>
+        <w:t xml:space="preserve">School Marksheets Column Isolation: </w:t>
+      </w:r>
+      <w:r>
+        <w:rPr>
+          <w:rFonts w:ascii="Segoe UI" w:hAnsi="Segoe UI"/>
+          <w:color w:val="282828"/>
+          <w:sz w:val="19"/>
+        </w:rPr>
+        <w:t>The verification queue 'School Marksheets' column is strictly isolated to educational qualification documents (10th, 12th, Diploma, Consolidated UG). Resumes and certificates are separated into their own designated columns.</w:t>
+      </w:r>
+    </w:p>
+    <w:p>
+      <w:pPr>
+        <w:pStyle w:val="ListBullet"/>
+        <w:spacing w:before="30" w:after="40" w:line="276" w:lineRule="auto"/>
+      </w:pPr>
+      <w:r>
+        <w:rPr>
+          <w:rFonts w:ascii="Segoe UI" w:hAnsi="Segoe UI"/>
+          <w:b/>
+          <w:color w:val="3D3777"/>
+          <w:sz w:val="19"/>
+        </w:rPr>
+        <w:t xml:space="preserve">Active Marksheet Scan Deduplication: </w:t>
+      </w:r>
+      <w:r>
+        <w:rPr>
+          <w:rFonts w:ascii="Segoe UI" w:hAnsi="Segoe UI"/>
+          <w:color w:val="282828"/>
+          <w:sz w:val="19"/>
+        </w:rPr>
+        <w:t>When a student re-uploads a corrected document, only the single latest active scan is displayed, preventing broken links and duplicate clutter.</w:t>
+      </w:r>
+    </w:p>
+    <w:p>
+      <w:pPr>
+        <w:pStyle w:val="ListBullet"/>
+        <w:spacing w:before="30" w:after="40" w:line="276" w:lineRule="auto"/>
+      </w:pPr>
+      <w:r>
+        <w:rPr>
+          <w:rFonts w:ascii="Segoe UI" w:hAnsi="Segoe UI"/>
+          <w:b/>
+          <w:color w:val="3D3777"/>
+          <w:sz w:val="19"/>
+        </w:rPr>
+        <w:t xml:space="preserve">Staff &amp; Mentor Password Management: </w:t>
+      </w:r>
+      <w:r>
+        <w:rPr>
+          <w:rFonts w:ascii="Segoe UI" w:hAnsi="Segoe UI"/>
+          <w:color w:val="282828"/>
+          <w:sz w:val="19"/>
+        </w:rPr>
+        <w:t>Added secure database password reset capabilities for campus coordinators and placement mentors (Migration 0071).</w:t>
+      </w:r>
+    </w:p>
+    <w:p>
+      <w:pPr>
+        <w:spacing w:before="280" w:after="80"/>
+      </w:pPr>
+      <w:r>
+        <w:rPr>
+          <w:rFonts w:ascii="Segoe UI" w:hAnsi="Segoe UI"/>
+          <w:b/>
+          <w:color w:val="D97706"/>
+          <w:sz w:val="24"/>
+        </w:rPr>
+        <w:t xml:space="preserve">[September 04, 2026] </w:t>
+      </w:r>
+      <w:r>
+        <w:rPr>
+          <w:rFonts w:ascii="Segoe UI" w:hAnsi="Segoe UI"/>
+          <w:b/>
+          <w:color w:val="3D3777"/>
+          <w:sz w:val="24"/>
+        </w:rPr>
+        <w:t>Automated Email Notification System &amp; Catalog Release</w:t>
+      </w:r>
+    </w:p>
+    <w:p>
+      <w:pPr>
+        <w:pStyle w:val="ListBullet"/>
+        <w:spacing w:before="30" w:after="40" w:line="276" w:lineRule="auto"/>
+      </w:pPr>
+      <w:r>
+        <w:rPr>
+          <w:rFonts w:ascii="Segoe UI" w:hAnsi="Segoe UI"/>
+          <w:b/>
+          <w:color w:val="3D3777"/>
+          <w:sz w:val="19"/>
+        </w:rPr>
+        <w:t xml:space="preserve">Automated Transactional Email Triggers: </w:t>
+      </w:r>
+      <w:r>
+        <w:rPr>
+          <w:rFonts w:ascii="Segoe UI" w:hAnsi="Segoe UI"/>
+          <w:color w:val="282828"/>
+          <w:sz w:val="19"/>
+        </w:rPr>
+        <w:t>Activated automated email dispatches for key placement milestones: SRF Approval Confirmation, SRF Rejection (with specific coordinator notes), New Placement Drive Announcements, Student Drive Registration Confirmation, and Shortlist Advancement Updates.</w:t>
+      </w:r>
+    </w:p>
+    <w:p>
+      <w:pPr>
+        <w:pStyle w:val="ListBullet"/>
+        <w:spacing w:before="30" w:after="40" w:line="276" w:lineRule="auto"/>
+      </w:pPr>
+      <w:r>
+        <w:rPr>
+          <w:rFonts w:ascii="Segoe UI" w:hAnsi="Segoe UI"/>
+          <w:b/>
+          <w:color w:val="3D3777"/>
+          <w:sz w:val="19"/>
+        </w:rPr>
+        <w:t xml:space="preserve">Official Email Notification Catalog: </w:t>
+      </w:r>
+      <w:r>
+        <w:rPr>
+          <w:rFonts w:ascii="Segoe UI" w:hAnsi="Segoe UI"/>
+          <w:color w:val="282828"/>
+          <w:sz w:val="19"/>
+        </w:rPr>
+        <w:t>Published comprehensive email catalog (docs/FACE_Prep_PMS_Email_Notification_Catalog.docx) detailing recipient rules, delivery triggers, dynamic template variables, and layout previews.</w:t>
+      </w:r>
+    </w:p>
+    <w:p>
+      <w:pPr>
+        <w:pStyle w:val="ListBullet"/>
+        <w:spacing w:before="30" w:after="40" w:line="276" w:lineRule="auto"/>
+      </w:pPr>
+      <w:r>
+        <w:rPr>
+          <w:rFonts w:ascii="Segoe UI" w:hAnsi="Segoe UI"/>
+          <w:b/>
+          <w:color w:val="3D3777"/>
+          <w:sz w:val="19"/>
+        </w:rPr>
+        <w:t xml:space="preserve">Resilient Dispatch Architecture: </w:t>
+      </w:r>
+      <w:r>
+        <w:rPr>
+          <w:rFonts w:ascii="Segoe UI" w:hAnsi="Segoe UI"/>
+          <w:color w:val="282828"/>
+          <w:sz w:val="19"/>
+        </w:rPr>
+        <w:t>Implemented decoupled email queue handling and background execution fallbacks so batch email operations never impede web interface responsiveness or core database transactions.</w:t>
+      </w:r>
+    </w:p>
+    <w:p>
+      <w:pPr>
+        <w:spacing w:before="320" w:after="80"/>
       </w:pPr>
       <w:r>
         <w:rPr>
@@ -50,449 +464,7 @@
           <w:color w:val="3D3777"/>
           <w:sz w:val="24"/>
         </w:rPr>
-        <w:t>1. Student Registration Form (SRF) — Board Grading &amp; Usability</w:t>
-      </w:r>
-    </w:p>
-    <w:p>
-      <w:pPr>
-        <w:pStyle w:val="ListBullet"/>
-        <w:spacing w:before="20" w:after="40" w:line="276" w:lineRule="auto"/>
-      </w:pPr>
-      <w:r>
-        <w:rPr>
-          <w:rFonts w:ascii="Segoe UI" w:hAnsi="Segoe UI"/>
-          <w:b/>
-          <w:color w:val="3D3777"/>
-          <w:sz w:val="19"/>
-        </w:rPr>
-        <w:t xml:space="preserve">Cambridge &amp; Other Boards: </w:t>
-      </w:r>
-      <w:r>
-        <w:rPr>
-          <w:rFonts w:ascii="Segoe UI" w:hAnsi="Segoe UI"/>
-          <w:color w:val="282828"/>
-          <w:sz w:val="19"/>
-        </w:rPr>
-        <w:t>Grade field is mandatory (e.g. A*, A, B, 7). Marks percentage is optional.</w:t>
-      </w:r>
-    </w:p>
-    <w:p>
-      <w:pPr>
-        <w:pStyle w:val="ListBullet"/>
-        <w:spacing w:before="20" w:after="40" w:line="276" w:lineRule="auto"/>
-      </w:pPr>
-      <w:r>
-        <w:rPr>
-          <w:rFonts w:ascii="Segoe UI" w:hAnsi="Segoe UI"/>
-          <w:b/>
-          <w:color w:val="3D3777"/>
-          <w:sz w:val="19"/>
-        </w:rPr>
-        <w:t xml:space="preserve">Standard Boards (CBSE / State / CISCE): </w:t>
-      </w:r>
-      <w:r>
-        <w:rPr>
-          <w:rFonts w:ascii="Segoe UI" w:hAnsi="Segoe UI"/>
-          <w:color w:val="282828"/>
-          <w:sz w:val="19"/>
-        </w:rPr>
-        <w:t>Marks percentage remains strictly mandatory (0–100%). Grade field is hidden.</w:t>
-      </w:r>
-    </w:p>
-    <w:p>
-      <w:pPr>
-        <w:pStyle w:val="ListBullet"/>
-        <w:spacing w:before="20" w:after="40" w:line="276" w:lineRule="auto"/>
-      </w:pPr>
-      <w:r>
-        <w:rPr>
-          <w:rFonts w:ascii="Segoe UI" w:hAnsi="Segoe UI"/>
-          <w:b/>
-          <w:color w:val="3D3777"/>
-          <w:sz w:val="19"/>
-        </w:rPr>
-        <w:t xml:space="preserve">Board Name (Other): </w:t>
-      </w:r>
-      <w:r>
-        <w:rPr>
-          <w:rFonts w:ascii="Segoe UI" w:hAnsi="Segoe UI"/>
-          <w:color w:val="282828"/>
-          <w:sz w:val="19"/>
-        </w:rPr>
-        <w:t>When 'Other' is selected, entering the official board name remains required.</w:t>
-      </w:r>
-    </w:p>
-    <w:p>
-      <w:pPr>
-        <w:pStyle w:val="ListBullet"/>
-        <w:spacing w:before="20" w:after="40" w:line="276" w:lineRule="auto"/>
-      </w:pPr>
-      <w:r>
-        <w:rPr>
-          <w:rFonts w:ascii="Segoe UI" w:hAnsi="Segoe UI"/>
-          <w:b/>
-          <w:color w:val="3D3777"/>
-          <w:sz w:val="19"/>
-        </w:rPr>
-        <w:t xml:space="preserve">Cumulative Arrear History &amp; Inline Errors: </w:t>
-      </w:r>
-      <w:r>
-        <w:rPr>
-          <w:rFonts w:ascii="Segoe UI" w:hAnsi="Segoe UI"/>
-          <w:color w:val="282828"/>
-          <w:sz w:val="19"/>
-        </w:rPr>
-        <w:t>Inline validation error messages are now rendered under Standing Arrears and Arrear History. The hint explicitly clarifies that Arrear History is cumulative across the degree up to that semester.</w:t>
-      </w:r>
-    </w:p>
-    <w:p>
-      <w:pPr>
-        <w:pStyle w:val="ListBullet"/>
-        <w:spacing w:before="20" w:after="40" w:line="276" w:lineRule="auto"/>
-      </w:pPr>
-      <w:r>
-        <w:rPr>
-          <w:rFonts w:ascii="Segoe UI" w:hAnsi="Segoe UI"/>
-          <w:b/>
-          <w:color w:val="3D3777"/>
-          <w:sz w:val="19"/>
-        </w:rPr>
-        <w:t xml:space="preserve">Non-Decreasing Arrear History Validation: </w:t>
-      </w:r>
-      <w:r>
-        <w:rPr>
-          <w:rFonts w:ascii="Segoe UI" w:hAnsi="Segoe UI"/>
-          <w:color w:val="282828"/>
-          <w:sz w:val="19"/>
-        </w:rPr>
-        <w:t>The system now validates across semesters that arrear history cannot decrease (e.g., entering 2 in Semester 1 and 1 in Semester 2 is prevented with a clear explanation).</w:t>
-      </w:r>
-    </w:p>
-    <w:p>
-      <w:pPr>
-        <w:pStyle w:val="ListBullet"/>
-        <w:spacing w:before="20" w:after="40" w:line="276" w:lineRule="auto"/>
-      </w:pPr>
-      <w:r>
-        <w:rPr>
-          <w:rFonts w:ascii="Segoe UI" w:hAnsi="Segoe UI"/>
-          <w:b/>
-          <w:color w:val="3D3777"/>
-          <w:sz w:val="19"/>
-        </w:rPr>
-        <w:t xml:space="preserve">Step Completion Checkmarks (✓): </w:t>
-      </w:r>
-      <w:r>
-        <w:rPr>
-          <w:rFonts w:ascii="Segoe UI" w:hAnsi="Segoe UI"/>
-          <w:color w:val="282828"/>
-          <w:sz w:val="19"/>
-        </w:rPr>
-        <w:t>Top navigation pills now dynamically display a checkmark (e.g. '1. Personal Details ✓') as soon as required fields in that section are filled.</w:t>
-      </w:r>
-    </w:p>
-    <w:p>
-      <w:pPr>
-        <w:pStyle w:val="ListBullet"/>
-        <w:spacing w:before="20" w:after="40" w:line="276" w:lineRule="auto"/>
-      </w:pPr>
-      <w:r>
-        <w:rPr>
-          <w:rFonts w:ascii="Segoe UI" w:hAnsi="Segoe UI"/>
-          <w:b/>
-          <w:color w:val="3D3777"/>
-          <w:sz w:val="19"/>
-        </w:rPr>
-        <w:t xml:space="preserve">Smart Mobile Number Sanitization: </w:t>
-      </w:r>
-      <w:r>
-        <w:rPr>
-          <w:rFonts w:ascii="Segoe UI" w:hAnsi="Segoe UI"/>
-          <w:color w:val="282828"/>
-          <w:sz w:val="19"/>
-        </w:rPr>
-        <w:t>Pasting phone numbers with country codes (+91, 91), leading zeros, spaces, or hyphens is automatically sanitized to 10 clean digits to prevent validation blocks.</w:t>
-      </w:r>
-    </w:p>
-    <w:p>
-      <w:pPr>
-        <w:pStyle w:val="ListBullet"/>
-        <w:spacing w:before="20" w:after="40" w:line="276" w:lineRule="auto"/>
-      </w:pPr>
-      <w:r>
-        <w:rPr>
-          <w:rFonts w:ascii="Segoe UI" w:hAnsi="Segoe UI"/>
-          <w:b/>
-          <w:color w:val="3D3777"/>
-          <w:sz w:val="19"/>
-        </w:rPr>
-        <w:t xml:space="preserve">Submission Error Focus &amp; Alert: </w:t>
-      </w:r>
-      <w:r>
-        <w:rPr>
-          <w:rFonts w:ascii="Segoe UI" w:hAnsi="Segoe UI"/>
-          <w:color w:val="282828"/>
-          <w:sz w:val="19"/>
-        </w:rPr>
-        <w:t>If required fields are missed on submit, an alert banner appears above the submit button and the page automatically scrolls to and focuses on the first invalid field.</w:t>
-      </w:r>
-    </w:p>
-    <w:p>
-      <w:pPr>
-        <w:spacing w:before="240" w:after="80"/>
-      </w:pPr>
-      <w:r>
-        <w:rPr>
-          <w:rFonts w:ascii="Segoe UI" w:hAnsi="Segoe UI"/>
-          <w:b/>
-          <w:color w:val="3D3777"/>
-          <w:sz w:val="24"/>
-        </w:rPr>
-        <w:t>2. Coordinator Verification Queue (/cpc/verification)</w:t>
-      </w:r>
-    </w:p>
-    <w:p>
-      <w:pPr>
-        <w:pStyle w:val="ListBullet"/>
-        <w:spacing w:before="20" w:after="40" w:line="276" w:lineRule="auto"/>
-      </w:pPr>
-      <w:r>
-        <w:rPr>
-          <w:rFonts w:ascii="Segoe UI" w:hAnsi="Segoe UI"/>
-          <w:b/>
-          <w:color w:val="3D3777"/>
-          <w:sz w:val="19"/>
-        </w:rPr>
-        <w:t xml:space="preserve">Grade Display for International Boards: </w:t>
-      </w:r>
-      <w:r>
-        <w:rPr>
-          <w:rFonts w:ascii="Segoe UI" w:hAnsi="Segoe UI"/>
-          <w:color w:val="282828"/>
-          <w:sz w:val="19"/>
-        </w:rPr>
-        <w:t>The 10th and 12th marks columns now display letter/scale grades (e.g. 'Grade: A*' or '91.4% (Grade: A*)') so coordinators can verify Cambridge/Other statements of results.</w:t>
-      </w:r>
-    </w:p>
-    <w:p>
-      <w:pPr>
-        <w:pStyle w:val="ListBullet"/>
-        <w:spacing w:before="20" w:after="40" w:line="276" w:lineRule="auto"/>
-      </w:pPr>
-      <w:r>
-        <w:rPr>
-          <w:rFonts w:ascii="Segoe UI" w:hAnsi="Segoe UI"/>
-          <w:b/>
-          <w:color w:val="3D3777"/>
-          <w:sz w:val="19"/>
-        </w:rPr>
-        <w:t xml:space="preserve">Arrear History Consistency (2 vs 1 Fix): </w:t>
-      </w:r>
-      <w:r>
-        <w:rPr>
-          <w:rFonts w:ascii="Segoe UI" w:hAnsi="Segoe UI"/>
-          <w:color w:val="282828"/>
-          <w:sz w:val="19"/>
-        </w:rPr>
-        <w:t>The 'Arrear history' summary column now correctly evaluates the maximum cumulative arrear history across all declared semesters, eliminating discrepancies where a student who declared 2 arrears was displayed with 1.</w:t>
-      </w:r>
-    </w:p>
-    <w:p>
-      <w:pPr>
-        <w:pStyle w:val="ListBullet"/>
-        <w:spacing w:before="20" w:after="40" w:line="276" w:lineRule="auto"/>
-      </w:pPr>
-      <w:r>
-        <w:rPr>
-          <w:rFonts w:ascii="Segoe UI" w:hAnsi="Segoe UI"/>
-          <w:b/>
-          <w:color w:val="3D3777"/>
-          <w:sz w:val="19"/>
-        </w:rPr>
-        <w:t xml:space="preserve">Standing Arrears Display &amp; Auto-Sync: </w:t>
-      </w:r>
-      <w:r>
-        <w:rPr>
-          <w:rFonts w:ascii="Segoe UI" w:hAnsi="Segoe UI"/>
-          <w:color w:val="282828"/>
-          <w:sz w:val="19"/>
-        </w:rPr>
-        <w:t>The Standing Arrears column accurately reflects the student's declared arrears from their latest semester, automatically synchronized into the student record upon submission.</w:t>
-      </w:r>
-    </w:p>
-    <w:p>
-      <w:pPr>
-        <w:pStyle w:val="ListBullet"/>
-        <w:spacing w:before="20" w:after="40" w:line="276" w:lineRule="auto"/>
-      </w:pPr>
-      <w:r>
-        <w:rPr>
-          <w:rFonts w:ascii="Segoe UI" w:hAnsi="Segoe UI"/>
-          <w:b/>
-          <w:color w:val="3D3777"/>
-          <w:sz w:val="19"/>
-        </w:rPr>
-        <w:t xml:space="preserve">School Marksheets Only: </w:t>
-      </w:r>
-      <w:r>
-        <w:rPr>
-          <w:rFonts w:ascii="Segoe UI" w:hAnsi="Segoe UI"/>
-          <w:color w:val="282828"/>
-          <w:sz w:val="19"/>
-        </w:rPr>
-        <w:t>The School Marksheets column displays only qualification marksheets (10th, 12th, Diploma, UG Consolidated). Certificates and resumes are kept in their own designated columns.</w:t>
-      </w:r>
-    </w:p>
-    <w:p>
-      <w:pPr>
-        <w:pStyle w:val="ListBullet"/>
-        <w:spacing w:before="20" w:after="40" w:line="276" w:lineRule="auto"/>
-      </w:pPr>
-      <w:r>
-        <w:rPr>
-          <w:rFonts w:ascii="Segoe UI" w:hAnsi="Segoe UI"/>
-          <w:b/>
-          <w:color w:val="3D3777"/>
-          <w:sz w:val="19"/>
-        </w:rPr>
-        <w:t xml:space="preserve">Single Latest Scan: </w:t>
-      </w:r>
-      <w:r>
-        <w:rPr>
-          <w:rFonts w:ascii="Segoe UI" w:hAnsi="Segoe UI"/>
-          <w:color w:val="282828"/>
-          <w:sz w:val="19"/>
-        </w:rPr>
-        <w:t>If a student uploads a revised marksheet, only the latest active scan is shown. Stale duplicate links from previous attempts are filtered out.</w:t>
-      </w:r>
-    </w:p>
-    <w:p>
-      <w:pPr>
-        <w:pStyle w:val="ListBullet"/>
-        <w:spacing w:before="20" w:after="40" w:line="276" w:lineRule="auto"/>
-      </w:pPr>
-      <w:r>
-        <w:rPr>
-          <w:rFonts w:ascii="Segoe UI" w:hAnsi="Segoe UI"/>
-          <w:b/>
-          <w:color w:val="3D3777"/>
-          <w:sz w:val="19"/>
-        </w:rPr>
-        <w:t xml:space="preserve">Label-Based File Display: </w:t>
-      </w:r>
-      <w:r>
-        <w:rPr>
-          <w:rFonts w:ascii="Segoe UI" w:hAnsi="Segoe UI"/>
-          <w:color w:val="282828"/>
-          <w:sz w:val="19"/>
-        </w:rPr>
-        <w:t>Documents appear as clean, clear labels ('10th marksheet', '12th marksheet', 'Diploma marksheet') rather than raw file names or storage paths.</w:t>
-      </w:r>
-    </w:p>
-    <w:p>
-      <w:pPr>
-        <w:pStyle w:val="ListBullet"/>
-        <w:spacing w:before="20" w:after="40" w:line="276" w:lineRule="auto"/>
-      </w:pPr>
-      <w:r>
-        <w:rPr>
-          <w:rFonts w:ascii="Segoe UI" w:hAnsi="Segoe UI"/>
-          <w:b/>
-          <w:color w:val="3D3777"/>
-          <w:sz w:val="19"/>
-        </w:rPr>
-        <w:t xml:space="preserve">Certificate Names + Files: </w:t>
-      </w:r>
-      <w:r>
-        <w:rPr>
-          <w:rFonts w:ascii="Segoe UI" w:hAnsi="Segoe UI"/>
-          <w:color w:val="282828"/>
-          <w:sz w:val="19"/>
-        </w:rPr>
-        <w:t>In the Certificates column, both the declared certificate name and original file name are clearly shown: e.g. AWS Cloud Practitioner (aws_cert.pdf).</w:t>
-      </w:r>
-    </w:p>
-    <w:p>
-      <w:pPr>
-        <w:pStyle w:val="ListBullet"/>
-        <w:spacing w:before="20" w:after="40" w:line="276" w:lineRule="auto"/>
-      </w:pPr>
-      <w:r>
-        <w:rPr>
-          <w:rFonts w:ascii="Segoe UI" w:hAnsi="Segoe UI"/>
-          <w:b/>
-          <w:color w:val="3D3777"/>
-          <w:sz w:val="19"/>
-        </w:rPr>
-        <w:t xml:space="preserve">Missing Documents Warning: </w:t>
-      </w:r>
-      <w:r>
-        <w:rPr>
-          <w:rFonts w:ascii="Segoe UI" w:hAnsi="Segoe UI"/>
-          <w:color w:val="282828"/>
-          <w:sz w:val="19"/>
-        </w:rPr>
-        <w:t>If a file is missing, an explicit warning badge ('None uploaded' / 'No marksheet') appears instead of dead links.</w:t>
-      </w:r>
-    </w:p>
-    <w:p>
-      <w:pPr>
-        <w:pStyle w:val="ListBullet"/>
-        <w:spacing w:before="20" w:after="40" w:line="276" w:lineRule="auto"/>
-      </w:pPr>
-      <w:r>
-        <w:rPr>
-          <w:rFonts w:ascii="Segoe UI" w:hAnsi="Segoe UI"/>
-          <w:b/>
-          <w:color w:val="3D3777"/>
-          <w:sz w:val="19"/>
-        </w:rPr>
-        <w:t xml:space="preserve">Add Semester Arrears Guard: </w:t>
-      </w:r>
-      <w:r>
-        <w:rPr>
-          <w:rFonts w:ascii="Segoe UI" w:hAnsi="Segoe UI"/>
-          <w:color w:val="282828"/>
-          <w:sz w:val="19"/>
-        </w:rPr>
-        <w:t>The subsequent semester submission form now validates that standing and historical arrears are valid non-negative whole numbers and that history is not lower than standing arrears.</w:t>
-      </w:r>
-    </w:p>
-    <w:p>
-      <w:pPr>
-        <w:pStyle w:val="ListBullet"/>
-        <w:spacing w:before="20" w:after="40" w:line="276" w:lineRule="auto"/>
-      </w:pPr>
-      <w:r>
-        <w:rPr>
-          <w:rFonts w:ascii="Segoe UI" w:hAnsi="Segoe UI"/>
-          <w:b/>
-          <w:color w:val="3D3777"/>
-          <w:sz w:val="19"/>
-        </w:rPr>
-        <w:t xml:space="preserve">Re-Verification Workflow: </w:t>
-      </w:r>
-      <w:r>
-        <w:rPr>
-          <w:rFonts w:ascii="Segoe UI" w:hAnsi="Segoe UI"/>
-          <w:color w:val="282828"/>
-          <w:sz w:val="19"/>
-        </w:rPr>
-        <w:t>Approved or rejected student records can be reset back to 'srf_submitted' (with semesters and certificates reset to 'pending') for complete re-verification.</w:t>
-      </w:r>
-    </w:p>
-    <w:p>
-      <w:pPr>
-        <w:spacing w:before="240" w:after="80"/>
-      </w:pPr>
-      <w:r>
-        <w:rPr>
-          <w:rFonts w:ascii="Segoe UI" w:hAnsi="Segoe UI"/>
-          <w:b/>
-          <w:color w:val="3D3777"/>
-          <w:sz w:val="24"/>
-        </w:rPr>
-        <w:t>3. Quick Comparison: Before vs. After</w:t>
+        <w:t>Date-Wise Summary: September 04 to September 11, 2026</w:t>
       </w:r>
     </w:p>
     <w:tbl>
@@ -510,11 +482,38 @@
         </w:tblBorders>
       </w:tblPr>
       <w:tblGrid>
-        <w:gridCol w:w="3312"/>
-        <w:gridCol w:w="3312"/>
-        <w:gridCol w:w="3312"/>
+        <w:gridCol w:w="2484"/>
+        <w:gridCol w:w="2484"/>
+        <w:gridCol w:w="2484"/>
+        <w:gridCol w:w="2484"/>
       </w:tblGrid>
       <w:tr>
+        <w:tc>
+          <w:tcPr>
+            <w:tcW w:type="dxa" w:w="1440"/>
+            <w:shd w:val="clear" w:color="auto" w:fill="3D3777"/>
+            <w:tcMar>
+              <w:top w:w="60" w:type="dxa"/>
+              <w:bottom w:w="60" w:type="dxa"/>
+              <w:left w:w="80" w:type="dxa"/>
+              <w:right w:w="80" w:type="dxa"/>
+            </w:tcMar>
+          </w:tcPr>
+          <w:p>
+            <w:pPr>
+              <w:spacing w:before="0" w:after="0" w:line="264" w:lineRule="auto"/>
+            </w:pPr>
+            <w:r>
+              <w:rPr>
+                <w:rFonts w:ascii="Segoe UI" w:hAnsi="Segoe UI"/>
+                <w:b/>
+                <w:color w:val="FFFFFF"/>
+                <w:sz w:val="17"/>
+              </w:rPr>
+              <w:t>Date</w:t>
+            </w:r>
+          </w:p>
+        </w:tc>
         <w:tc>
           <w:tcPr>
             <w:tcW w:type="dxa" w:w="2592"/>
@@ -537,13 +536,13 @@
                 <w:color w:val="FFFFFF"/>
                 <w:sz w:val="17"/>
               </w:rPr>
-              <w:t>Feature</w:t>
+              <w:t>Feature / Area</w:t>
             </w:r>
           </w:p>
         </w:tc>
         <w:tc>
           <w:tcPr>
-            <w:tcW w:type="dxa" w:w="3600"/>
+            <w:tcW w:type="dxa" w:w="3024"/>
             <w:shd w:val="clear" w:color="auto" w:fill="3D3777"/>
             <w:tcMar>
               <w:top w:w="60" w:type="dxa"/>
@@ -563,13 +562,13 @@
                 <w:color w:val="FFFFFF"/>
                 <w:sz w:val="17"/>
               </w:rPr>
-              <w:t>Before (Problem)</w:t>
+              <w:t>Previous State (Problem)</w:t>
             </w:r>
           </w:p>
         </w:tc>
         <w:tc>
           <w:tcPr>
-            <w:tcW w:type="dxa" w:w="3600"/>
+            <w:tcW w:type="dxa" w:w="3312"/>
             <w:shd w:val="clear" w:color="auto" w:fill="3D3777"/>
             <w:tcMar>
               <w:top w:w="60" w:type="dxa"/>
@@ -589,12 +588,38 @@
                 <w:color w:val="FFFFFF"/>
                 <w:sz w:val="17"/>
               </w:rPr>
-              <w:t>Now (Simple &amp; Clean)</w:t>
+              <w:t>Updated Behavior (Proper Fix)</w:t>
             </w:r>
           </w:p>
         </w:tc>
       </w:tr>
       <w:tr>
+        <w:tc>
+          <w:tcPr>
+            <w:tcW w:type="dxa" w:w="1440"/>
+            <w:shd w:val="clear" w:color="auto" w:fill="F8FAFC"/>
+            <w:tcMar>
+              <w:top w:w="60" w:type="dxa"/>
+              <w:bottom w:w="60" w:type="dxa"/>
+              <w:left w:w="80" w:type="dxa"/>
+              <w:right w:w="80" w:type="dxa"/>
+            </w:tcMar>
+          </w:tcPr>
+          <w:p>
+            <w:pPr>
+              <w:spacing w:before="0" w:after="0" w:line="264" w:lineRule="auto"/>
+            </w:pPr>
+            <w:r>
+              <w:rPr>
+                <w:rFonts w:ascii="Segoe UI" w:hAnsi="Segoe UI"/>
+                <w:b/>
+                <w:color w:val="D97706"/>
+                <w:sz w:val="17"/>
+              </w:rPr>
+              <w:t>2026-09-11</w:t>
+            </w:r>
+          </w:p>
+        </w:tc>
         <w:tc>
           <w:tcPr>
             <w:tcW w:type="dxa" w:w="2592"/>
@@ -617,13 +642,13 @@
                 <w:color w:val="3D3777"/>
                 <w:sz w:val="17"/>
               </w:rPr>
-              <w:t>Cambridge Board</w:t>
+              <w:t>Dropdown Replacement</w:t>
             </w:r>
           </w:p>
         </w:tc>
         <w:tc>
           <w:tcPr>
-            <w:tcW w:type="dxa" w:w="3600"/>
+            <w:tcW w:type="dxa" w:w="3024"/>
             <w:shd w:val="clear" w:color="auto" w:fill="F8FAFC"/>
             <w:tcMar>
               <w:top w:w="60" w:type="dxa"/>
@@ -642,13 +667,13 @@
                 <w:color w:val="282828"/>
                 <w:sz w:val="17"/>
               </w:rPr>
-              <w:t>Mandatory 0–100% percentage. No grade field.</w:t>
+              <w:t>Changing dropdowns left old data or orphan fields behind.</w:t>
             </w:r>
           </w:p>
         </w:tc>
         <w:tc>
           <w:tcPr>
-            <w:tcW w:type="dxa" w:w="3600"/>
+            <w:tcW w:type="dxa" w:w="3312"/>
             <w:shd w:val="clear" w:color="auto" w:fill="F8FAFC"/>
             <w:tcMar>
               <w:top w:w="60" w:type="dxa"/>
@@ -667,12 +692,38 @@
                 <w:color w:val="282828"/>
                 <w:sz w:val="17"/>
               </w:rPr>
-              <w:t>Grade is mandatory (A*, A, B). Percentage is optional.</w:t>
+              <w:t>Dropdown choices cleanly replace previous values and reset child fields.</w:t>
             </w:r>
           </w:p>
         </w:tc>
       </w:tr>
       <w:tr>
+        <w:tc>
+          <w:tcPr>
+            <w:tcW w:type="dxa" w:w="1440"/>
+            <w:shd w:val="clear" w:color="auto" w:fill="FFFFFF"/>
+            <w:tcMar>
+              <w:top w:w="60" w:type="dxa"/>
+              <w:bottom w:w="60" w:type="dxa"/>
+              <w:left w:w="80" w:type="dxa"/>
+              <w:right w:w="80" w:type="dxa"/>
+            </w:tcMar>
+          </w:tcPr>
+          <w:p>
+            <w:pPr>
+              <w:spacing w:before="0" w:after="0" w:line="264" w:lineRule="auto"/>
+            </w:pPr>
+            <w:r>
+              <w:rPr>
+                <w:rFonts w:ascii="Segoe UI" w:hAnsi="Segoe UI"/>
+                <w:b/>
+                <w:color w:val="D97706"/>
+                <w:sz w:val="17"/>
+              </w:rPr>
+              <w:t>2026-09-11</w:t>
+            </w:r>
+          </w:p>
+        </w:tc>
         <w:tc>
           <w:tcPr>
             <w:tcW w:type="dxa" w:w="2592"/>
@@ -695,13 +746,13 @@
                 <w:color w:val="3D3777"/>
                 <w:sz w:val="17"/>
               </w:rPr>
-              <w:t>Other Board</w:t>
+              <w:t>Conditional Sanitization</w:t>
             </w:r>
           </w:p>
         </w:tc>
         <w:tc>
           <w:tcPr>
-            <w:tcW w:type="dxa" w:w="3600"/>
+            <w:tcW w:type="dxa" w:w="3024"/>
             <w:shd w:val="clear" w:color="auto" w:fill="FFFFFF"/>
             <w:tcMar>
               <w:top w:w="60" w:type="dxa"/>
@@ -720,13 +771,13 @@
                 <w:color w:val="282828"/>
                 <w:sz w:val="17"/>
               </w:rPr>
-              <w:t>Mandatory 0–100% percentage. No grade field.</w:t>
+              <w:t>Old state board states / PG entries persisted in drafts.</w:t>
             </w:r>
           </w:p>
         </w:tc>
         <w:tc>
           <w:tcPr>
-            <w:tcW w:type="dxa" w:w="3600"/>
+            <w:tcW w:type="dxa" w:w="3312"/>
             <w:shd w:val="clear" w:color="auto" w:fill="FFFFFF"/>
             <w:tcMar>
               <w:top w:w="60" w:type="dxa"/>
@@ -745,12 +796,38 @@
                 <w:color w:val="282828"/>
                 <w:sz w:val="17"/>
               </w:rPr>
-              <w:t>Grade is mandatory. Board name required. % is optional.</w:t>
+              <w:t>Obsolete conditional values are automatically sanitized on live change and draft merge.</w:t>
             </w:r>
           </w:p>
         </w:tc>
       </w:tr>
       <w:tr>
+        <w:tc>
+          <w:tcPr>
+            <w:tcW w:type="dxa" w:w="1440"/>
+            <w:shd w:val="clear" w:color="auto" w:fill="F8FAFC"/>
+            <w:tcMar>
+              <w:top w:w="60" w:type="dxa"/>
+              <w:bottom w:w="60" w:type="dxa"/>
+              <w:left w:w="80" w:type="dxa"/>
+              <w:right w:w="80" w:type="dxa"/>
+            </w:tcMar>
+          </w:tcPr>
+          <w:p>
+            <w:pPr>
+              <w:spacing w:before="0" w:after="0" w:line="264" w:lineRule="auto"/>
+            </w:pPr>
+            <w:r>
+              <w:rPr>
+                <w:rFonts w:ascii="Segoe UI" w:hAnsi="Segoe UI"/>
+                <w:b/>
+                <w:color w:val="D97706"/>
+                <w:sz w:val="17"/>
+              </w:rPr>
+              <w:t>2026-09-11</w:t>
+            </w:r>
+          </w:p>
+        </w:tc>
         <w:tc>
           <w:tcPr>
             <w:tcW w:type="dxa" w:w="2592"/>
@@ -773,13 +850,13 @@
                 <w:color w:val="3D3777"/>
                 <w:sz w:val="17"/>
               </w:rPr>
-              <w:t>Standard Boards</w:t>
+              <w:t>Field Label Highlighting</w:t>
             </w:r>
           </w:p>
         </w:tc>
         <w:tc>
           <w:tcPr>
-            <w:tcW w:type="dxa" w:w="3600"/>
+            <w:tcW w:type="dxa" w:w="3024"/>
             <w:shd w:val="clear" w:color="auto" w:fill="F8FAFC"/>
             <w:tcMar>
               <w:top w:w="60" w:type="dxa"/>
@@ -798,13 +875,13 @@
                 <w:color w:val="282828"/>
                 <w:sz w:val="17"/>
               </w:rPr>
-              <w:t>Mandatory percentage (0–100%).</w:t>
+              <w:t>Labels remained plain grey when inputs were empty or invalid.</w:t>
             </w:r>
           </w:p>
         </w:tc>
         <w:tc>
           <w:tcPr>
-            <w:tcW w:type="dxa" w:w="3600"/>
+            <w:tcW w:type="dxa" w:w="3312"/>
             <w:shd w:val="clear" w:color="auto" w:fill="F8FAFC"/>
             <w:tcMar>
               <w:top w:w="60" w:type="dxa"/>
@@ -823,12 +900,38 @@
                 <w:color w:val="282828"/>
                 <w:sz w:val="17"/>
               </w:rPr>
-              <w:t>Unchanged. Percentage remains mandatory (0–100%).</w:t>
+              <w:t>Field labels highlight in bold red (text-danger-700) with an 'Invalid' badge.</w:t>
             </w:r>
           </w:p>
         </w:tc>
       </w:tr>
       <w:tr>
+        <w:tc>
+          <w:tcPr>
+            <w:tcW w:type="dxa" w:w="1440"/>
+            <w:shd w:val="clear" w:color="auto" w:fill="FFFFFF"/>
+            <w:tcMar>
+              <w:top w:w="60" w:type="dxa"/>
+              <w:bottom w:w="60" w:type="dxa"/>
+              <w:left w:w="80" w:type="dxa"/>
+              <w:right w:w="80" w:type="dxa"/>
+            </w:tcMar>
+          </w:tcPr>
+          <w:p>
+            <w:pPr>
+              <w:spacing w:before="0" w:after="0" w:line="264" w:lineRule="auto"/>
+            </w:pPr>
+            <w:r>
+              <w:rPr>
+                <w:rFonts w:ascii="Segoe UI" w:hAnsi="Segoe UI"/>
+                <w:b/>
+                <w:color w:val="D97706"/>
+                <w:sz w:val="17"/>
+              </w:rPr>
+              <w:t>2026-09-11</w:t>
+            </w:r>
+          </w:p>
+        </w:tc>
         <w:tc>
           <w:tcPr>
             <w:tcW w:type="dxa" w:w="2592"/>
@@ -851,13 +954,13 @@
                 <w:color w:val="3D3777"/>
                 <w:sz w:val="17"/>
               </w:rPr>
-              <w:t>Verification Grades</w:t>
+              <w:t>Real-Time Error Clearing</w:t>
             </w:r>
           </w:p>
         </w:tc>
         <w:tc>
           <w:tcPr>
-            <w:tcW w:type="dxa" w:w="3600"/>
+            <w:tcW w:type="dxa" w:w="3024"/>
             <w:shd w:val="clear" w:color="auto" w:fill="FFFFFF"/>
             <w:tcMar>
               <w:top w:w="60" w:type="dxa"/>
@@ -876,13 +979,13 @@
                 <w:color w:val="282828"/>
                 <w:sz w:val="17"/>
               </w:rPr>
-              <w:t>Only percentages displayed; Cambridge grades invisible.</w:t>
+              <w:t>Error indicators remained until full form submit.</w:t>
             </w:r>
           </w:p>
         </w:tc>
         <w:tc>
           <w:tcPr>
-            <w:tcW w:type="dxa" w:w="3600"/>
+            <w:tcW w:type="dxa" w:w="3312"/>
             <w:shd w:val="clear" w:color="auto" w:fill="FFFFFF"/>
             <w:tcMar>
               <w:top w:w="60" w:type="dxa"/>
@@ -901,12 +1004,38 @@
                 <w:color w:val="282828"/>
                 <w:sz w:val="17"/>
               </w:rPr>
-              <w:t>Displays letter grade (e.g. Grade: A*) alongside or in place of %.</w:t>
+              <w:t>Label highlighting and invalid badge clear instantly as user types or picks value.</w:t>
             </w:r>
           </w:p>
         </w:tc>
       </w:tr>
       <w:tr>
+        <w:tc>
+          <w:tcPr>
+            <w:tcW w:type="dxa" w:w="1440"/>
+            <w:shd w:val="clear" w:color="auto" w:fill="F8FAFC"/>
+            <w:tcMar>
+              <w:top w:w="60" w:type="dxa"/>
+              <w:bottom w:w="60" w:type="dxa"/>
+              <w:left w:w="80" w:type="dxa"/>
+              <w:right w:w="80" w:type="dxa"/>
+            </w:tcMar>
+          </w:tcPr>
+          <w:p>
+            <w:pPr>
+              <w:spacing w:before="0" w:after="0" w:line="264" w:lineRule="auto"/>
+            </w:pPr>
+            <w:r>
+              <w:rPr>
+                <w:rFonts w:ascii="Segoe UI" w:hAnsi="Segoe UI"/>
+                <w:b/>
+                <w:color w:val="D97706"/>
+                <w:sz w:val="17"/>
+              </w:rPr>
+              <w:t>2026-09-11</w:t>
+            </w:r>
+          </w:p>
+        </w:tc>
         <w:tc>
           <w:tcPr>
             <w:tcW w:type="dxa" w:w="2592"/>
@@ -929,13 +1058,13 @@
                 <w:color w:val="3D3777"/>
                 <w:sz w:val="17"/>
               </w:rPr>
-              <w:t>Arrear History Count</w:t>
+              <w:t>Scale Switch Validation</w:t>
             </w:r>
           </w:p>
         </w:tc>
         <w:tc>
           <w:tcPr>
-            <w:tcW w:type="dxa" w:w="3600"/>
+            <w:tcW w:type="dxa" w:w="3024"/>
             <w:shd w:val="clear" w:color="auto" w:fill="F8FAFC"/>
             <w:tcMar>
               <w:top w:w="60" w:type="dxa"/>
@@ -954,13 +1083,13 @@
                 <w:color w:val="282828"/>
                 <w:sz w:val="17"/>
               </w:rPr>
-              <w:t>Queue showed 1 arrear history when student entered 2 across semesters.</w:t>
+              <w:t>Toggling CGPA/Percentage scale did not revalidate marks.</w:t>
             </w:r>
           </w:p>
         </w:tc>
         <w:tc>
           <w:tcPr>
-            <w:tcW w:type="dxa" w:w="3600"/>
+            <w:tcW w:type="dxa" w:w="3312"/>
             <w:shd w:val="clear" w:color="auto" w:fill="F8FAFC"/>
             <w:tcMar>
               <w:top w:w="60" w:type="dxa"/>
@@ -979,12 +1108,38 @@
                 <w:color w:val="282828"/>
                 <w:sz w:val="17"/>
               </w:rPr>
-              <w:t>Queue accurately evaluates cumulative arrear history (2) across all semesters.</w:t>
+              <w:t>Immediately re-evaluates all semester marks upon scale change in real time.</w:t>
             </w:r>
           </w:p>
         </w:tc>
       </w:tr>
       <w:tr>
+        <w:tc>
+          <w:tcPr>
+            <w:tcW w:type="dxa" w:w="1440"/>
+            <w:shd w:val="clear" w:color="auto" w:fill="FFFFFF"/>
+            <w:tcMar>
+              <w:top w:w="60" w:type="dxa"/>
+              <w:bottom w:w="60" w:type="dxa"/>
+              <w:left w:w="80" w:type="dxa"/>
+              <w:right w:w="80" w:type="dxa"/>
+            </w:tcMar>
+          </w:tcPr>
+          <w:p>
+            <w:pPr>
+              <w:spacing w:before="0" w:after="0" w:line="264" w:lineRule="auto"/>
+            </w:pPr>
+            <w:r>
+              <w:rPr>
+                <w:rFonts w:ascii="Segoe UI" w:hAnsi="Segoe UI"/>
+                <w:b/>
+                <w:color w:val="D97706"/>
+                <w:sz w:val="17"/>
+              </w:rPr>
+              <w:t>2026-09-10</w:t>
+            </w:r>
+          </w:p>
+        </w:tc>
         <w:tc>
           <w:tcPr>
             <w:tcW w:type="dxa" w:w="2592"/>
@@ -1007,13 +1162,13 @@
                 <w:color w:val="3D3777"/>
                 <w:sz w:val="17"/>
               </w:rPr>
-              <w:t>Arrears Field Errors</w:t>
+              <w:t>Verification Board Grades</w:t>
             </w:r>
           </w:p>
         </w:tc>
         <w:tc>
           <w:tcPr>
-            <w:tcW w:type="dxa" w:w="3600"/>
+            <w:tcW w:type="dxa" w:w="3024"/>
             <w:shd w:val="clear" w:color="auto" w:fill="FFFFFF"/>
             <w:tcMar>
               <w:top w:w="60" w:type="dxa"/>
@@ -1032,13 +1187,13 @@
                 <w:color w:val="282828"/>
                 <w:sz w:val="17"/>
               </w:rPr>
-              <w:t>No error text under Standing or History of Arrears inputs.</w:t>
+              <w:t>Cambridge/Other letter grades were invisible to CPCs.</w:t>
             </w:r>
           </w:p>
         </w:tc>
         <w:tc>
           <w:tcPr>
-            <w:tcW w:type="dxa" w:w="3600"/>
+            <w:tcW w:type="dxa" w:w="3312"/>
             <w:shd w:val="clear" w:color="auto" w:fill="FFFFFF"/>
             <w:tcMar>
               <w:top w:w="60" w:type="dxa"/>
@@ -1057,12 +1212,38 @@
                 <w:color w:val="282828"/>
                 <w:sz w:val="17"/>
               </w:rPr>
-              <w:t>Inline error text displayed directly beneath each arrears field.</w:t>
+              <w:t>Displays letter grades (Grade: A*) alongside percentage in verification queue.</w:t>
             </w:r>
           </w:p>
         </w:tc>
       </w:tr>
       <w:tr>
+        <w:tc>
+          <w:tcPr>
+            <w:tcW w:type="dxa" w:w="1440"/>
+            <w:shd w:val="clear" w:color="auto" w:fill="F8FAFC"/>
+            <w:tcMar>
+              <w:top w:w="60" w:type="dxa"/>
+              <w:bottom w:w="60" w:type="dxa"/>
+              <w:left w:w="80" w:type="dxa"/>
+              <w:right w:w="80" w:type="dxa"/>
+            </w:tcMar>
+          </w:tcPr>
+          <w:p>
+            <w:pPr>
+              <w:spacing w:before="0" w:after="0" w:line="264" w:lineRule="auto"/>
+            </w:pPr>
+            <w:r>
+              <w:rPr>
+                <w:rFonts w:ascii="Segoe UI" w:hAnsi="Segoe UI"/>
+                <w:b/>
+                <w:color w:val="D97706"/>
+                <w:sz w:val="17"/>
+              </w:rPr>
+              <w:t>2026-09-10</w:t>
+            </w:r>
+          </w:p>
+        </w:tc>
         <w:tc>
           <w:tcPr>
             <w:tcW w:type="dxa" w:w="2592"/>
@@ -1085,13 +1266,13 @@
                 <w:color w:val="3D3777"/>
                 <w:sz w:val="17"/>
               </w:rPr>
-              <w:t>Arrear History Consistency</w:t>
+              <w:t>Arrear History Accuracy</w:t>
             </w:r>
           </w:p>
         </w:tc>
         <w:tc>
           <w:tcPr>
-            <w:tcW w:type="dxa" w:w="3600"/>
+            <w:tcW w:type="dxa" w:w="3024"/>
             <w:shd w:val="clear" w:color="auto" w:fill="F8FAFC"/>
             <w:tcMar>
               <w:top w:w="60" w:type="dxa"/>
@@ -1110,13 +1291,13 @@
                 <w:color w:val="282828"/>
                 <w:sz w:val="17"/>
               </w:rPr>
-              <w:t>Form allowed arrear history to drop in later semesters.</w:t>
+              <w:t>Queue showed 1 arrear history when student entered 2.</w:t>
             </w:r>
           </w:p>
         </w:tc>
         <w:tc>
           <w:tcPr>
-            <w:tcW w:type="dxa" w:w="3600"/>
+            <w:tcW w:type="dxa" w:w="3312"/>
             <w:shd w:val="clear" w:color="auto" w:fill="F8FAFC"/>
             <w:tcMar>
               <w:top w:w="60" w:type="dxa"/>
@@ -1135,12 +1316,38 @@
                 <w:color w:val="282828"/>
                 <w:sz w:val="17"/>
               </w:rPr>
-              <w:t>Strict cross-semester check prevents arrear history from decreasing.</w:t>
+              <w:t>Accurately calculates cumulative maximum arrear history across all semesters.</w:t>
             </w:r>
           </w:p>
         </w:tc>
       </w:tr>
       <w:tr>
+        <w:tc>
+          <w:tcPr>
+            <w:tcW w:type="dxa" w:w="1440"/>
+            <w:shd w:val="clear" w:color="auto" w:fill="FFFFFF"/>
+            <w:tcMar>
+              <w:top w:w="60" w:type="dxa"/>
+              <w:bottom w:w="60" w:type="dxa"/>
+              <w:left w:w="80" w:type="dxa"/>
+              <w:right w:w="80" w:type="dxa"/>
+            </w:tcMar>
+          </w:tcPr>
+          <w:p>
+            <w:pPr>
+              <w:spacing w:before="0" w:after="0" w:line="264" w:lineRule="auto"/>
+            </w:pPr>
+            <w:r>
+              <w:rPr>
+                <w:rFonts w:ascii="Segoe UI" w:hAnsi="Segoe UI"/>
+                <w:b/>
+                <w:color w:val="D97706"/>
+                <w:sz w:val="17"/>
+              </w:rPr>
+              <w:t>2026-09-10</w:t>
+            </w:r>
+          </w:p>
+        </w:tc>
         <w:tc>
           <w:tcPr>
             <w:tcW w:type="dxa" w:w="2592"/>
@@ -1163,13 +1370,13 @@
                 <w:color w:val="3D3777"/>
                 <w:sz w:val="17"/>
               </w:rPr>
-              <w:t>Standing Arrears</w:t>
+              <w:t>Database Arrears Sync</w:t>
             </w:r>
           </w:p>
         </w:tc>
         <w:tc>
           <w:tcPr>
-            <w:tcW w:type="dxa" w:w="3600"/>
+            <w:tcW w:type="dxa" w:w="3024"/>
             <w:shd w:val="clear" w:color="auto" w:fill="FFFFFF"/>
             <w:tcMar>
               <w:top w:w="60" w:type="dxa"/>
@@ -1188,13 +1395,13 @@
                 <w:color w:val="282828"/>
                 <w:sz w:val="17"/>
               </w:rPr>
-              <w:t>Queue showed 0 arrears despite semester declaration.</w:t>
+              <w:t>Latest arrears were not synced to students table.</w:t>
             </w:r>
           </w:p>
         </w:tc>
         <w:tc>
           <w:tcPr>
-            <w:tcW w:type="dxa" w:w="3600"/>
+            <w:tcW w:type="dxa" w:w="3312"/>
             <w:shd w:val="clear" w:color="auto" w:fill="FFFFFF"/>
             <w:tcMar>
               <w:top w:w="60" w:type="dxa"/>
@@ -1213,12 +1420,38 @@
                 <w:color w:val="282828"/>
                 <w:sz w:val="17"/>
               </w:rPr>
-              <w:t>Accurately displays standing arrears synced from latest semester.</w:t>
+              <w:t>Database trigger automatically synchronizes standing arrears on submission.</w:t>
             </w:r>
           </w:p>
         </w:tc>
       </w:tr>
       <w:tr>
+        <w:tc>
+          <w:tcPr>
+            <w:tcW w:type="dxa" w:w="1440"/>
+            <w:shd w:val="clear" w:color="auto" w:fill="F8FAFC"/>
+            <w:tcMar>
+              <w:top w:w="60" w:type="dxa"/>
+              <w:bottom w:w="60" w:type="dxa"/>
+              <w:left w:w="80" w:type="dxa"/>
+              <w:right w:w="80" w:type="dxa"/>
+            </w:tcMar>
+          </w:tcPr>
+          <w:p>
+            <w:pPr>
+              <w:spacing w:before="0" w:after="0" w:line="264" w:lineRule="auto"/>
+            </w:pPr>
+            <w:r>
+              <w:rPr>
+                <w:rFonts w:ascii="Segoe UI" w:hAnsi="Segoe UI"/>
+                <w:b/>
+                <w:color w:val="D97706"/>
+                <w:sz w:val="17"/>
+              </w:rPr>
+              <w:t>2026-09-10</w:t>
+            </w:r>
+          </w:p>
+        </w:tc>
         <w:tc>
           <w:tcPr>
             <w:tcW w:type="dxa" w:w="2592"/>
@@ -1241,13 +1474,13 @@
                 <w:color w:val="3D3777"/>
                 <w:sz w:val="17"/>
               </w:rPr>
-              <w:t>Step Navigation</w:t>
+              <w:t>Marksheet Isolation</w:t>
             </w:r>
           </w:p>
         </w:tc>
         <w:tc>
           <w:tcPr>
-            <w:tcW w:type="dxa" w:w="3600"/>
+            <w:tcW w:type="dxa" w:w="3024"/>
             <w:shd w:val="clear" w:color="auto" w:fill="F8FAFC"/>
             <w:tcMar>
               <w:top w:w="60" w:type="dxa"/>
@@ -1266,13 +1499,13 @@
                 <w:color w:val="282828"/>
                 <w:sz w:val="17"/>
               </w:rPr>
-              <w:t>Numbered pills gave no indication of completed sections.</w:t>
+              <w:t>Queue marksheet column was cluttered with resumes and certs.</w:t>
             </w:r>
           </w:p>
         </w:tc>
         <w:tc>
           <w:tcPr>
-            <w:tcW w:type="dxa" w:w="3600"/>
+            <w:tcW w:type="dxa" w:w="3312"/>
             <w:shd w:val="clear" w:color="auto" w:fill="F8FAFC"/>
             <w:tcMar>
               <w:top w:w="60" w:type="dxa"/>
@@ -1291,12 +1524,38 @@
                 <w:color w:val="282828"/>
                 <w:sz w:val="17"/>
               </w:rPr>
-              <w:t>Displays ✓ checkmark on completed steps (e.g. 1. Personal Details ✓).</w:t>
+              <w:t>Shows strictly educational marksheets; resumes and certs in dedicated columns.</w:t>
             </w:r>
           </w:p>
         </w:tc>
       </w:tr>
       <w:tr>
+        <w:tc>
+          <w:tcPr>
+            <w:tcW w:type="dxa" w:w="1440"/>
+            <w:shd w:val="clear" w:color="auto" w:fill="FFFFFF"/>
+            <w:tcMar>
+              <w:top w:w="60" w:type="dxa"/>
+              <w:bottom w:w="60" w:type="dxa"/>
+              <w:left w:w="80" w:type="dxa"/>
+              <w:right w:w="80" w:type="dxa"/>
+            </w:tcMar>
+          </w:tcPr>
+          <w:p>
+            <w:pPr>
+              <w:spacing w:before="0" w:after="0" w:line="264" w:lineRule="auto"/>
+            </w:pPr>
+            <w:r>
+              <w:rPr>
+                <w:rFonts w:ascii="Segoe UI" w:hAnsi="Segoe UI"/>
+                <w:b/>
+                <w:color w:val="D97706"/>
+                <w:sz w:val="17"/>
+              </w:rPr>
+              <w:t>2026-09-04</w:t>
+            </w:r>
+          </w:p>
+        </w:tc>
         <w:tc>
           <w:tcPr>
             <w:tcW w:type="dxa" w:w="2592"/>
@@ -1319,13 +1578,13 @@
                 <w:color w:val="3D3777"/>
                 <w:sz w:val="17"/>
               </w:rPr>
-              <w:t>Mobile Validation</w:t>
+              <w:t>Email Notification Engine</w:t>
             </w:r>
           </w:p>
         </w:tc>
         <w:tc>
           <w:tcPr>
-            <w:tcW w:type="dxa" w:w="3600"/>
+            <w:tcW w:type="dxa" w:w="3024"/>
             <w:shd w:val="clear" w:color="auto" w:fill="FFFFFF"/>
             <w:tcMar>
               <w:top w:w="60" w:type="dxa"/>
@@ -1344,13 +1603,13 @@
                 <w:color w:val="282828"/>
                 <w:sz w:val="17"/>
               </w:rPr>
-              <w:t>Failed validation on +91, spaces, or hyphens.</w:t>
+              <w:t>No automated email alerts sent to students or staff.</w:t>
             </w:r>
           </w:p>
         </w:tc>
         <w:tc>
           <w:tcPr>
-            <w:tcW w:type="dxa" w:w="3600"/>
+            <w:tcW w:type="dxa" w:w="3312"/>
             <w:shd w:val="clear" w:color="auto" w:fill="FFFFFF"/>
             <w:tcMar>
               <w:top w:w="60" w:type="dxa"/>
@@ -1369,12 +1628,38 @@
                 <w:color w:val="282828"/>
                 <w:sz w:val="17"/>
               </w:rPr>
-              <w:t>Automatically strips +91, spaces, and hyphens to 10 digits.</w:t>
+              <w:t>Automated transactional emails for SRF approval, rejection, and drives.</w:t>
             </w:r>
           </w:p>
         </w:tc>
       </w:tr>
       <w:tr>
+        <w:tc>
+          <w:tcPr>
+            <w:tcW w:type="dxa" w:w="1440"/>
+            <w:shd w:val="clear" w:color="auto" w:fill="F8FAFC"/>
+            <w:tcMar>
+              <w:top w:w="60" w:type="dxa"/>
+              <w:bottom w:w="60" w:type="dxa"/>
+              <w:left w:w="80" w:type="dxa"/>
+              <w:right w:w="80" w:type="dxa"/>
+            </w:tcMar>
+          </w:tcPr>
+          <w:p>
+            <w:pPr>
+              <w:spacing w:before="0" w:after="0" w:line="264" w:lineRule="auto"/>
+            </w:pPr>
+            <w:r>
+              <w:rPr>
+                <w:rFonts w:ascii="Segoe UI" w:hAnsi="Segoe UI"/>
+                <w:b/>
+                <w:color w:val="D97706"/>
+                <w:sz w:val="17"/>
+              </w:rPr>
+              <w:t>2026-09-04</w:t>
+            </w:r>
+          </w:p>
+        </w:tc>
         <w:tc>
           <w:tcPr>
             <w:tcW w:type="dxa" w:w="2592"/>
@@ -1397,13 +1682,13 @@
                 <w:color w:val="3D3777"/>
                 <w:sz w:val="17"/>
               </w:rPr>
-              <w:t>Submission Errors</w:t>
+              <w:t>Notification Catalog</w:t>
             </w:r>
           </w:p>
         </w:tc>
         <w:tc>
           <w:tcPr>
-            <w:tcW w:type="dxa" w:w="3600"/>
+            <w:tcW w:type="dxa" w:w="3024"/>
             <w:shd w:val="clear" w:color="auto" w:fill="F8FAFC"/>
             <w:tcMar>
               <w:top w:w="60" w:type="dxa"/>
@@ -1422,13 +1707,13 @@
                 <w:color w:val="282828"/>
                 <w:sz w:val="17"/>
               </w:rPr>
-              <w:t>Silent validation block or confusion on missed fields.</w:t>
+              <w:t>No standardized documentation for email templates.</w:t>
             </w:r>
           </w:p>
         </w:tc>
         <w:tc>
           <w:tcPr>
-            <w:tcW w:type="dxa" w:w="3600"/>
+            <w:tcW w:type="dxa" w:w="3312"/>
             <w:shd w:val="clear" w:color="auto" w:fill="F8FAFC"/>
             <w:tcMar>
               <w:top w:w="60" w:type="dxa"/>
@@ -1447,397 +1732,7 @@
                 <w:color w:val="282828"/>
                 <w:sz w:val="17"/>
               </w:rPr>
-              <w:t>Shows red alert banner and smoothly scrolls to first invalid field.</w:t>
-            </w:r>
-          </w:p>
-        </w:tc>
-      </w:tr>
-      <w:tr>
-        <w:tc>
-          <w:tcPr>
-            <w:tcW w:type="dxa" w:w="2592"/>
-            <w:shd w:val="clear" w:color="auto" w:fill="FFFFFF"/>
-            <w:tcMar>
-              <w:top w:w="60" w:type="dxa"/>
-              <w:bottom w:w="60" w:type="dxa"/>
-              <w:left w:w="80" w:type="dxa"/>
-              <w:right w:w="80" w:type="dxa"/>
-            </w:tcMar>
-          </w:tcPr>
-          <w:p>
-            <w:pPr>
-              <w:spacing w:before="0" w:after="0" w:line="264" w:lineRule="auto"/>
-            </w:pPr>
-            <w:r>
-              <w:rPr>
-                <w:rFonts w:ascii="Segoe UI" w:hAnsi="Segoe UI"/>
-                <w:b/>
-                <w:color w:val="3D3777"/>
-                <w:sz w:val="17"/>
-              </w:rPr>
-              <w:t>School Marksheets Column</w:t>
-            </w:r>
-          </w:p>
-        </w:tc>
-        <w:tc>
-          <w:tcPr>
-            <w:tcW w:type="dxa" w:w="3600"/>
-            <w:shd w:val="clear" w:color="auto" w:fill="FFFFFF"/>
-            <w:tcMar>
-              <w:top w:w="60" w:type="dxa"/>
-              <w:bottom w:w="60" w:type="dxa"/>
-              <w:left w:w="80" w:type="dxa"/>
-              <w:right w:w="80" w:type="dxa"/>
-            </w:tcMar>
-          </w:tcPr>
-          <w:p>
-            <w:pPr>
-              <w:spacing w:before="0" w:after="0" w:line="264" w:lineRule="auto"/>
-            </w:pPr>
-            <w:r>
-              <w:rPr>
-                <w:rFonts w:ascii="Segoe UI" w:hAnsi="Segoe UI"/>
-                <w:color w:val="282828"/>
-                <w:sz w:val="17"/>
-              </w:rPr>
-              <w:t>Cluttered with certificates, resumes, and offer letters.</w:t>
-            </w:r>
-          </w:p>
-        </w:tc>
-        <w:tc>
-          <w:tcPr>
-            <w:tcW w:type="dxa" w:w="3600"/>
-            <w:shd w:val="clear" w:color="auto" w:fill="FFFFFF"/>
-            <w:tcMar>
-              <w:top w:w="60" w:type="dxa"/>
-              <w:bottom w:w="60" w:type="dxa"/>
-              <w:left w:w="80" w:type="dxa"/>
-              <w:right w:w="80" w:type="dxa"/>
-            </w:tcMar>
-          </w:tcPr>
-          <w:p>
-            <w:pPr>
-              <w:spacing w:before="0" w:after="0" w:line="264" w:lineRule="auto"/>
-            </w:pPr>
-            <w:r>
-              <w:rPr>
-                <w:rFonts w:ascii="Segoe UI" w:hAnsi="Segoe UI"/>
-                <w:color w:val="282828"/>
-                <w:sz w:val="17"/>
-              </w:rPr>
-              <w:t>Shows strictly school marksheets (10th, 12th, Diploma, UG).</w:t>
-            </w:r>
-          </w:p>
-        </w:tc>
-      </w:tr>
-      <w:tr>
-        <w:tc>
-          <w:tcPr>
-            <w:tcW w:type="dxa" w:w="2592"/>
-            <w:shd w:val="clear" w:color="auto" w:fill="F8FAFC"/>
-            <w:tcMar>
-              <w:top w:w="60" w:type="dxa"/>
-              <w:bottom w:w="60" w:type="dxa"/>
-              <w:left w:w="80" w:type="dxa"/>
-              <w:right w:w="80" w:type="dxa"/>
-            </w:tcMar>
-          </w:tcPr>
-          <w:p>
-            <w:pPr>
-              <w:spacing w:before="0" w:after="0" w:line="264" w:lineRule="auto"/>
-            </w:pPr>
-            <w:r>
-              <w:rPr>
-                <w:rFonts w:ascii="Segoe UI" w:hAnsi="Segoe UI"/>
-                <w:b/>
-                <w:color w:val="3D3777"/>
-                <w:sz w:val="17"/>
-              </w:rPr>
-              <w:t>Resubmitted Scans</w:t>
-            </w:r>
-          </w:p>
-        </w:tc>
-        <w:tc>
-          <w:tcPr>
-            <w:tcW w:type="dxa" w:w="3600"/>
-            <w:shd w:val="clear" w:color="auto" w:fill="F8FAFC"/>
-            <w:tcMar>
-              <w:top w:w="60" w:type="dxa"/>
-              <w:bottom w:w="60" w:type="dxa"/>
-              <w:left w:w="80" w:type="dxa"/>
-              <w:right w:w="80" w:type="dxa"/>
-            </w:tcMar>
-          </w:tcPr>
-          <w:p>
-            <w:pPr>
-              <w:spacing w:before="0" w:after="0" w:line="264" w:lineRule="auto"/>
-            </w:pPr>
-            <w:r>
-              <w:rPr>
-                <w:rFonts w:ascii="Segoe UI" w:hAnsi="Segoe UI"/>
-                <w:color w:val="282828"/>
-                <w:sz w:val="17"/>
-              </w:rPr>
-              <w:t>Showed duplicate old links for every re-upload.</w:t>
-            </w:r>
-          </w:p>
-        </w:tc>
-        <w:tc>
-          <w:tcPr>
-            <w:tcW w:type="dxa" w:w="3600"/>
-            <w:shd w:val="clear" w:color="auto" w:fill="F8FAFC"/>
-            <w:tcMar>
-              <w:top w:w="60" w:type="dxa"/>
-              <w:bottom w:w="60" w:type="dxa"/>
-              <w:left w:w="80" w:type="dxa"/>
-              <w:right w:w="80" w:type="dxa"/>
-            </w:tcMar>
-          </w:tcPr>
-          <w:p>
-            <w:pPr>
-              <w:spacing w:before="0" w:after="0" w:line="264" w:lineRule="auto"/>
-            </w:pPr>
-            <w:r>
-              <w:rPr>
-                <w:rFonts w:ascii="Segoe UI" w:hAnsi="Segoe UI"/>
-                <w:color w:val="282828"/>
-                <w:sz w:val="17"/>
-              </w:rPr>
-              <w:t>Deduplicated: shows only the single latest active scan.</w:t>
-            </w:r>
-          </w:p>
-        </w:tc>
-      </w:tr>
-      <w:tr>
-        <w:tc>
-          <w:tcPr>
-            <w:tcW w:type="dxa" w:w="2592"/>
-            <w:shd w:val="clear" w:color="auto" w:fill="FFFFFF"/>
-            <w:tcMar>
-              <w:top w:w="60" w:type="dxa"/>
-              <w:bottom w:w="60" w:type="dxa"/>
-              <w:left w:w="80" w:type="dxa"/>
-              <w:right w:w="80" w:type="dxa"/>
-            </w:tcMar>
-          </w:tcPr>
-          <w:p>
-            <w:pPr>
-              <w:spacing w:before="0" w:after="0" w:line="264" w:lineRule="auto"/>
-            </w:pPr>
-            <w:r>
-              <w:rPr>
-                <w:rFonts w:ascii="Segoe UI" w:hAnsi="Segoe UI"/>
-                <w:b/>
-                <w:color w:val="3D3777"/>
-                <w:sz w:val="17"/>
-              </w:rPr>
-              <w:t>Document Links</w:t>
-            </w:r>
-          </w:p>
-        </w:tc>
-        <w:tc>
-          <w:tcPr>
-            <w:tcW w:type="dxa" w:w="3600"/>
-            <w:shd w:val="clear" w:color="auto" w:fill="FFFFFF"/>
-            <w:tcMar>
-              <w:top w:w="60" w:type="dxa"/>
-              <w:bottom w:w="60" w:type="dxa"/>
-              <w:left w:w="80" w:type="dxa"/>
-              <w:right w:w="80" w:type="dxa"/>
-            </w:tcMar>
-          </w:tcPr>
-          <w:p>
-            <w:pPr>
-              <w:spacing w:before="0" w:after="0" w:line="264" w:lineRule="auto"/>
-            </w:pPr>
-            <w:r>
-              <w:rPr>
-                <w:rFonts w:ascii="Segoe UI" w:hAnsi="Segoe UI"/>
-                <w:color w:val="282828"/>
-                <w:sz w:val="17"/>
-              </w:rPr>
-              <w:t>Raw storage names / inconsistent tags.</w:t>
-            </w:r>
-          </w:p>
-        </w:tc>
-        <w:tc>
-          <w:tcPr>
-            <w:tcW w:type="dxa" w:w="3600"/>
-            <w:shd w:val="clear" w:color="auto" w:fill="FFFFFF"/>
-            <w:tcMar>
-              <w:top w:w="60" w:type="dxa"/>
-              <w:bottom w:w="60" w:type="dxa"/>
-              <w:left w:w="80" w:type="dxa"/>
-              <w:right w:w="80" w:type="dxa"/>
-            </w:tcMar>
-          </w:tcPr>
-          <w:p>
-            <w:pPr>
-              <w:spacing w:before="0" w:after="0" w:line="264" w:lineRule="auto"/>
-            </w:pPr>
-            <w:r>
-              <w:rPr>
-                <w:rFonts w:ascii="Segoe UI" w:hAnsi="Segoe UI"/>
-                <w:color w:val="282828"/>
-                <w:sz w:val="17"/>
-              </w:rPr>
-              <w:t>Standardized labels: '10th marksheet', '12th marksheet'.</w:t>
-            </w:r>
-          </w:p>
-        </w:tc>
-      </w:tr>
-      <w:tr>
-        <w:tc>
-          <w:tcPr>
-            <w:tcW w:type="dxa" w:w="2592"/>
-            <w:shd w:val="clear" w:color="auto" w:fill="F8FAFC"/>
-            <w:tcMar>
-              <w:top w:w="60" w:type="dxa"/>
-              <w:bottom w:w="60" w:type="dxa"/>
-              <w:left w:w="80" w:type="dxa"/>
-              <w:right w:w="80" w:type="dxa"/>
-            </w:tcMar>
-          </w:tcPr>
-          <w:p>
-            <w:pPr>
-              <w:spacing w:before="0" w:after="0" w:line="264" w:lineRule="auto"/>
-            </w:pPr>
-            <w:r>
-              <w:rPr>
-                <w:rFonts w:ascii="Segoe UI" w:hAnsi="Segoe UI"/>
-                <w:b/>
-                <w:color w:val="3D3777"/>
-                <w:sz w:val="17"/>
-              </w:rPr>
-              <w:t>Certificates Display</w:t>
-            </w:r>
-          </w:p>
-        </w:tc>
-        <w:tc>
-          <w:tcPr>
-            <w:tcW w:type="dxa" w:w="3600"/>
-            <w:shd w:val="clear" w:color="auto" w:fill="F8FAFC"/>
-            <w:tcMar>
-              <w:top w:w="60" w:type="dxa"/>
-              <w:bottom w:w="60" w:type="dxa"/>
-              <w:left w:w="80" w:type="dxa"/>
-              <w:right w:w="80" w:type="dxa"/>
-            </w:tcMar>
-          </w:tcPr>
-          <w:p>
-            <w:pPr>
-              <w:spacing w:before="0" w:after="0" w:line="264" w:lineRule="auto"/>
-            </w:pPr>
-            <w:r>
-              <w:rPr>
-                <w:rFonts w:ascii="Segoe UI" w:hAnsi="Segoe UI"/>
-                <w:color w:val="282828"/>
-                <w:sz w:val="17"/>
-              </w:rPr>
-              <w:t>Generic label without file context.</w:t>
-            </w:r>
-          </w:p>
-        </w:tc>
-        <w:tc>
-          <w:tcPr>
-            <w:tcW w:type="dxa" w:w="3600"/>
-            <w:shd w:val="clear" w:color="auto" w:fill="F8FAFC"/>
-            <w:tcMar>
-              <w:top w:w="60" w:type="dxa"/>
-              <w:bottom w:w="60" w:type="dxa"/>
-              <w:left w:w="80" w:type="dxa"/>
-              <w:right w:w="80" w:type="dxa"/>
-            </w:tcMar>
-          </w:tcPr>
-          <w:p>
-            <w:pPr>
-              <w:spacing w:before="0" w:after="0" w:line="264" w:lineRule="auto"/>
-            </w:pPr>
-            <w:r>
-              <w:rPr>
-                <w:rFonts w:ascii="Segoe UI" w:hAnsi="Segoe UI"/>
-                <w:color w:val="282828"/>
-                <w:sz w:val="17"/>
-              </w:rPr>
-              <w:t>Shows Certificate Name + Original File Name.</w:t>
-            </w:r>
-          </w:p>
-        </w:tc>
-      </w:tr>
-      <w:tr>
-        <w:tc>
-          <w:tcPr>
-            <w:tcW w:type="dxa" w:w="2592"/>
-            <w:shd w:val="clear" w:color="auto" w:fill="FFFFFF"/>
-            <w:tcMar>
-              <w:top w:w="60" w:type="dxa"/>
-              <w:bottom w:w="60" w:type="dxa"/>
-              <w:left w:w="80" w:type="dxa"/>
-              <w:right w:w="80" w:type="dxa"/>
-            </w:tcMar>
-          </w:tcPr>
-          <w:p>
-            <w:pPr>
-              <w:spacing w:before="0" w:after="0" w:line="264" w:lineRule="auto"/>
-            </w:pPr>
-            <w:r>
-              <w:rPr>
-                <w:rFonts w:ascii="Segoe UI" w:hAnsi="Segoe UI"/>
-                <w:b/>
-                <w:color w:val="3D3777"/>
-                <w:sz w:val="17"/>
-              </w:rPr>
-              <w:t>Re-Verification</w:t>
-            </w:r>
-          </w:p>
-        </w:tc>
-        <w:tc>
-          <w:tcPr>
-            <w:tcW w:type="dxa" w:w="3600"/>
-            <w:shd w:val="clear" w:color="auto" w:fill="FFFFFF"/>
-            <w:tcMar>
-              <w:top w:w="60" w:type="dxa"/>
-              <w:bottom w:w="60" w:type="dxa"/>
-              <w:left w:w="80" w:type="dxa"/>
-              <w:right w:w="80" w:type="dxa"/>
-            </w:tcMar>
-          </w:tcPr>
-          <w:p>
-            <w:pPr>
-              <w:spacing w:before="0" w:after="0" w:line="264" w:lineRule="auto"/>
-            </w:pPr>
-            <w:r>
-              <w:rPr>
-                <w:rFonts w:ascii="Segoe UI" w:hAnsi="Segoe UI"/>
-                <w:color w:val="282828"/>
-                <w:sz w:val="17"/>
-              </w:rPr>
-              <w:t>Approved records locked without queue re-entry.</w:t>
-            </w:r>
-          </w:p>
-        </w:tc>
-        <w:tc>
-          <w:tcPr>
-            <w:tcW w:type="dxa" w:w="3600"/>
-            <w:shd w:val="clear" w:color="auto" w:fill="FFFFFF"/>
-            <w:tcMar>
-              <w:top w:w="60" w:type="dxa"/>
-              <w:bottom w:w="60" w:type="dxa"/>
-              <w:left w:w="80" w:type="dxa"/>
-              <w:right w:w="80" w:type="dxa"/>
-            </w:tcMar>
-          </w:tcPr>
-          <w:p>
-            <w:pPr>
-              <w:spacing w:before="0" w:after="0" w:line="264" w:lineRule="auto"/>
-            </w:pPr>
-            <w:r>
-              <w:rPr>
-                <w:rFonts w:ascii="Segoe UI" w:hAnsi="Segoe UI"/>
-                <w:color w:val="282828"/>
-                <w:sz w:val="17"/>
-              </w:rPr>
-              <w:t>Resetting status returns record to queue for full coordinator re-check.</w:t>
+              <w:t>Published official email notification catalog with triggers and templates.</w:t>
             </w:r>
           </w:p>
         </w:tc>
@@ -1868,7 +1763,7 @@
         <w:color w:val="969696"/>
         <w:sz w:val="17"/>
       </w:rPr>
-      <w:t>Confidential — Placement Operations Documentation — September 2026</w:t>
+      <w:t>Confidential — Placement Operations Documentation — September 04 to September 11, 2026</w:t>
     </w:r>
   </w:p>
 </w:ftr>
@@ -1887,7 +1782,7 @@
         <w:color w:val="969696"/>
         <w:sz w:val="17"/>
       </w:rPr>
-      <w:t>FPC Placement Management System — Release Summary</w:t>
+      <w:t>FPC Placement Management System — September 2026 Release Changelog</w:t>
     </w:r>
   </w:p>
 </w:hdr>

</xml_diff>